<commit_message>
bitacora agregada al procesamiento por lote
</commit_message>
<xml_diff>
--- a/templates/Escritura_3_Registro_3.docx
+++ b/templates/Escritura_3_Registro_3.docx
@@ -375,7 +375,28 @@
           <w:szCs w:val="20"/>
           <w:rtl w:val="0"/>
         </w:rPr>
-        <w:t xml:space="preserve">Quedamos a su entera disposición para coordinar una demostración práctica del sistema.</w:t>
+        <w:t xml:space="preserve">Quedamos a su entera disposición para coordinar una demostración práctica del sistema. Para una demo puede acceder a </w:t>
+      </w:r>
+      <w:hyperlink r:id="rId7">
+        <w:r>
+          <w:rPr>
+            <w:color w:val="1155cc"/>
+            <w:sz w:val="20"/>
+            <w:szCs w:val="20"/>
+            <w:u w:val="single"/>
+            <w:rtl w:val="0"/>
+          </w:rPr>
+          <w:t xml:space="preserve">https://carpincho2025.servidoronline.net</w:t>
+        </w:r>
+      </w:hyperlink>
+      <w:r>
+        <w:rPr>
+          <w:color w:val="334155"/>
+          <w:sz w:val="20"/>
+          <w:szCs w:val="20"/>
+          <w:rtl w:val="0"/>
+        </w:rPr>
+        <w:t xml:space="preserve">. Ahí encontrará la versión 2.0 y el manual del usuario, Así como el teléfono de contacto.</w:t>
         <w:br w:type="textWrapping"/>
         <w:br w:type="textWrapping"/>
         <w:t xml:space="preserve">Atentamente,</w:t>

</xml_diff>